<commit_message>
correct Julia's Folie 6 slide-6 speech to match actual deck bullets
- fix SAIC governance stats to match the deck (~73% state ownership via
  SASAC + other Chinese state-linked blockholders, not a single 64% stake;
  add missing Fan et al. 18% post-IPO underperformance bullet; restore the
  slide's own punchline "slow capital reallocation -> strategic inflexibility")
- clarify slide 6 has no shared takeaway box (unlike 8/10/12): Chiara closes
  with Geely's own one-liner, not an invented quote
- restore missing EU-tariff slide bullet (adaptability rises as control
  concentrates) and the slide's takeaway line on Folie 7
- restore ROE 0.58% figure on Folie 8 and fix "EV platform" wording on
  Folie 10 to match the deck instead of a wiki-sourced paraphrase
- add missing "2020-2025 natural experiment" bullet on Folie 15
- re-export docx from the corrected markdown
</commit_message>
<xml_diff>
--- a/research/wiki/saic-motor/Doc/praesentation-sprechtext-julia.docx
+++ b/research/wiki/saic-motor/Doc/praesentation-sprechtext-julia.docx
@@ -41,7 +41,7 @@
         <w:t>Geschätzte Redezeit:</w:t>
       </w:r>
       <w:r>
-        <w:t xml:space="preserve"> ~1.725 Wörter ≈ </w:t>
+        <w:t xml:space="preserve"> ~1.779 Wörter ≈ </w:t>
       </w:r>
       <w:r>
         <w:rPr>
@@ -50,7 +50,7 @@
         <w:t>~13 Minuten</w:t>
       </w:r>
       <w:r>
-        <w:t xml:space="preserve"> (12,3 min @140 wpm / 13,3 min @130 wpm)</w:t>
+        <w:t xml:space="preserve"> (12,7 min @140 wpm / 13,7 min @130 wpm)</w:t>
       </w:r>
     </w:p>
     <w:p>
@@ -690,20 +690,7 @@
         <w:pStyle w:val="IntenseQuote"/>
       </w:pPr>
       <w:r>
-        <w:t>Start with SAIC. Control runs through two layers: Shanghai's state asset commission, SASAC, sits above SAIC Group, which holds about sixty-four percent of the listed company. So "state-owned" means a chain of command, not just a big shareholder — SAIC's own 2025 annual report writes the Party's leadership into the charter, under what it calls the "two consistencies" principle.</w:t>
-      </w:r>
-    </w:p>
-    <w:p>
-      <w:pPr>
-        <w:pStyle w:val="IntenseQuote"/>
-      </w:pPr>
-    </w:p>
-    <w:p>
-      <w:pPr>
-        <w:pStyle w:val="IntenseQuote"/>
-      </w:pPr>
-      <w:r>
-        <w:t>What does that cost in practice? Speed. Take SAIC-GM: sales collapsed, but SAIC could not restructure the venture unilaterally — any major move needs sign-off up that chain. A private board could act in weeks. Here it took years.</w:t>
+        <w:t>Start with SAIC. The state owns roughly seventy-three percent — that is not one single block, it is SASAC's own stake plus several other Chinese state-linked institutional holders, all pulling in the same direction — and the Party mandate is written directly into the charter, so SAIC does not just optimise for shareholder value, it optimises beyond it. That has a real cost: politically connected firms like this one lag about eighteen percent in performance after listing, according to Fan and colleagues. And it shows up operationally too — SAIC cannot exit an unprofitable joint venture without state sign-off. Put those together and you get slow capital reallocation, and strategic inflexibility exactly when speed matters most.</w:t>
       </w:r>
     </w:p>
     <w:p>
@@ -714,15 +701,25 @@
         <w:t>→ [HANDOFF]</w:t>
       </w:r>
       <w:r>
-        <w:t xml:space="preserve"> Batu übernimmt den BYD-Teil, Chiara den Geely-Teil. Chiara beendet die Folie:</w:t>
+        <w:t xml:space="preserve"> Batu übernimmt den BYD-Teil, Chiara den Geely-Teil. </w:t>
       </w:r>
-    </w:p>
-    <w:p>
       <w:r>
         <w:rPr>
-          <w:i/>
+          <w:b/>
         </w:rPr>
-        <w:t>"So control runs on a scale, from political at SAIC to fully commercial at BYD. Next, the EU put a real price on this difference."</w:t>
+        <w:t>Achtung:</w:t>
+      </w:r>
+      <w:r>
+        <w:t xml:space="preserve"> Anders als Folie 8/10/12 gibt es hier </w:t>
+      </w:r>
+      <w:r>
+        <w:rPr>
+          <w:b/>
+        </w:rPr>
+        <w:t>keine gemeinsame Fazit-Box</w:t>
+      </w:r>
+      <w:r>
+        <w:t xml:space="preserve"> — jede Spalte hat nur ihre eigene Ein-Zeiler-Pointe (SAIC: "Slow capital reallocation → strategic inflexibility", die du gerade mit gesagt hast). Chiara schließt die Folie einfach mit Geelys Pointe ("Loss-making subsidiaries = contingent liability") und leitet dann zu Folie 7 über — kein wörtliches Zitat nötig, das ist ihre eigene Überleitung.</w:t>
       </w:r>
     </w:p>
     <w:p/>
@@ -773,7 +770,7 @@
         <w:pStyle w:val="IntenseQuote"/>
       </w:pPr>
       <w:r>
-        <w:t>That gap is not about car quality — it is about state dependence. For SAIC the Commission even used what is called "facts available," a formal finding that applies when a company does not fully cooperate — in this case, because the group held back some financing data. Interesting detail: the provisional rate before the final ruling was even higher, 36.3 percent. The correction moved by just one point — SAIC still sits at the top of the scale by a wide margin over its domestic rivals.</w:t>
+        <w:t>That gap is not about car quality — it is about state dependence. For SAIC the Commission even used what is called "facts available," a formal finding that applies when a company does not fully cooperate — in this case, because the group held back some financing data. There is a pattern behind that number, too: adaptability rises the more control concentrates — a joint-venture board that needs both partners' consent moves slower than state oversight, which moves slower still than a single founder deciding alone.</w:t>
       </w:r>
     </w:p>
     <w:p>
@@ -786,7 +783,7 @@
         <w:pStyle w:val="IntenseQuote"/>
       </w:pPr>
       <w:r>
-        <w:t>So a neutral regulator, with its own investigators and its own incentive to get this right, reached the same conclusion we reach from the inside: control structure drives competitive position. And for a firm like SAIC that depends on exports such as MG to offset a shrinking home market, that tariff is not a one-off fine — it is a direct, lasting cost of the governance model it chose, one that compounds every year exports continue.</w:t>
+        <w:t>So a neutral regulator, with its own investigators and its own incentive to get this right, reached the same conclusion we reach from the inside: governance is a first-order determinant of competitive position, not an administrative footnote. And for a firm like SAIC that depends on exports such as MG to offset a shrinking home market, that tariff is a direct, lasting cost of the governance model it chose.</w:t>
       </w:r>
     </w:p>
     <w:p>
@@ -840,7 +837,7 @@
         <w:pStyle w:val="IntenseQuote"/>
       </w:pPr>
       <w:r>
-        <w:t>SAIC was capital-light: its joint-venture partners — Volkswagen, General Motors — co-invested in the factories, and SAIC collected roughly half the equity income without carrying the full risk. That felt safe — until SAIC-GM sales fell by more than half, triggering write-downs of over thirty billion renminbi in 2024. The same fifty-fifty structure that once shared the upside now shared the downside, and SAIC was still bound to absorb its share, with no unilateral control to fix the business. Net profit fell eighty-eight percent; the capital-light model had become a capital trap.</w:t>
+        <w:t>SAIC was capital-light: its joint-venture partners — Volkswagen, General Motors — co-invested in the factories, and SAIC collected roughly half the equity income without carrying the full risk. That felt safe — until SAIC-GM sales fell by more than half, triggering write-downs of over thirty billion renminbi in 2024. The same fifty-fifty structure that once shared the upside now shared the downside, and SAIC was still bound to absorb its share, with no unilateral control to fix the business. Net profit fell eighty-eight percent, and return on equity dropped to just zero point five eight percent — the capital-light model had become a capital trap.</w:t>
       </w:r>
     </w:p>
     <w:p>
@@ -897,7 +894,7 @@
         <w:pStyle w:val="IntenseQuote"/>
       </w:pPr>
       <w:r>
-        <w:t>SAIC's route was mandated technology transfer: the price of market access was a joint venture meant to work as a classroom. It did work, to a point — studies find roughly an eight percent quality gain. But steady JV profit also removed the pressure to invent: why fund risky in-house R&amp;D when the joint venture already pays the dividend? SAIC has poured over one hundred fifty billion renminbi cumulatively into EV investment, and still holds no proprietary battery supply chain, unlike BYD. It had the capital, but not the platform.</w:t>
+        <w:t>SAIC's route was mandated technology transfer: the price of market access was a joint venture meant to work as a classroom. It did work, to a point — studies find roughly an eight percent quality gain. But steady JV profit also removed the pressure to invent: why fund risky in-house R&amp;D when the joint venture already pays the dividend? SAIC has poured over one hundred fifty billion renminbi cumulatively into EV investment, and still had no EV platform of its own when the cycle turned. It had the capital, but not the platform.</w:t>
       </w:r>
     </w:p>
     <w:p>
@@ -1277,7 +1274,7 @@
         <w:pStyle w:val="IntenseQuote"/>
       </w:pPr>
       <w:r>
-        <w:t>Here is the core point. Across all four lenses — governance, financing, capability, and viability — structure, more than starting technology, decided the outcome.</w:t>
+        <w:t>Here is the core point. Across all four lenses — governance, financing, capability, and viability — structure, more than starting technology, decided the outcome. Think of 2020 to 2025 as a natural experiment: same industry, same technology shock, three different governance structures — and the outcomes split exactly along those structural lines.</w:t>
       </w:r>
     </w:p>
     <w:p>
@@ -1451,7 +1448,7 @@
         <w:pStyle w:val="ListBullet"/>
       </w:pPr>
       <w:r>
-        <w:t>SAIC: SASAC → SAIC Group (~64%) → SAIC Motor · "two consistencies" im Statut · 2025: Aufsichtsrat abgeschafft → Audit Committee</w:t>
+        <w:t>SAIC: Staat ~73% (SASAC + weitere chinesische staatsnahe Blockholder zusammen, kein Einzelblock!) · Partei-Mandat im Statut → optimiert über Shareholder Value hinaus</w:t>
       </w:r>
     </w:p>
     <w:p>
@@ -1459,7 +1456,7 @@
         <w:pStyle w:val="ListBullet"/>
       </w:pPr>
       <w:r>
-        <w:t>Beispiel Speed-Kosten: SAIC-GM — keine einseitige Restrukturierung möglich, Jahre statt Wochen</w:t>
+        <w:t>Connected firms lag ~18% post-IPO (Fan et al., 2007)</w:t>
       </w:r>
     </w:p>
     <w:p>
@@ -1467,7 +1464,23 @@
         <w:pStyle w:val="ListBullet"/>
       </w:pPr>
       <w:r>
-        <w:t>⚠️ STOPP nach "...it took years." → Batu (BYD) und Chiara (Geely) folgen, Chiara beendet die Folie</w:t>
+        <w:t>Kann unprofitable JV nicht ohne Staats-Sign-off verlassen</w:t>
+      </w:r>
+    </w:p>
+    <w:p>
+      <w:pPr>
+        <w:pStyle w:val="ListBullet"/>
+      </w:pPr>
+      <w:r>
+        <w:t>Pointe (steht so auf der Folie!): "Slow capital reallocation → strategic inflexibility"</w:t>
+      </w:r>
+    </w:p>
+    <w:p>
+      <w:pPr>
+        <w:pStyle w:val="ListBullet"/>
+      </w:pPr>
+      <w:r>
+        <w:t>⚠️ STOPP nach "...matters most." → Batu (BYD) und Chiara (Geely) folgen. Kein gemeinsamer Fazit-Kasten auf dieser Folie — Chiara schließt mit Geelys eigener Pointe</w:t>
       </w:r>
     </w:p>
     <w:p>
@@ -1508,6 +1521,22 @@
       </w:pPr>
       <w:r>
         <w:t>SAIC: "facts available" (Daten zurückgehalten!)</w:t>
+      </w:r>
+    </w:p>
+    <w:p>
+      <w:pPr>
+        <w:pStyle w:val="ListBullet"/>
+      </w:pPr>
+      <w:r>
+        <w:t>2. Folien-Bullet (nicht vergessen!): Anpassungsfähigkeit steigt mit Kontrollkonzentration — JV-Board (beide Partner) → Staatsaufsicht → Founder-Control</w:t>
+      </w:r>
+    </w:p>
+    <w:p>
+      <w:pPr>
+        <w:pStyle w:val="ListBullet"/>
+      </w:pPr>
+      <w:r>
+        <w:t>Merksatz (Fazit-Box): "Governance is a first-order determinant of competitive position, not an administrative footnote."</w:t>
       </w:r>
     </w:p>
     <w:p>
@@ -1553,7 +1582,7 @@
         <w:pStyle w:val="ListBullet"/>
       </w:pPr>
       <w:r>
-        <w:t>SAIC capital-light-Mechanik: JV-Partner (VW/GM) investieren, SAIC kassiert ~50% Equity Income, fast 40 Jahre lang gut gegangen</w:t>
+        <w:t>SAIC capital-light-Mechanik: JV-Partner (VW/GM) investieren, SAIC kassiert ~50% Equity Income</w:t>
       </w:r>
     </w:p>
     <w:p>
@@ -1561,7 +1590,16 @@
         <w:pStyle w:val="ListBullet"/>
       </w:pPr>
       <w:r>
-        <w:t>Kipppunkt: SAIC-GM Absatz −56,5% → Abschreibungen &gt;30 Mrd. RMB (2024) → Gewinn −88% → ROE nur 0,58%</w:t>
+        <w:t xml:space="preserve">Kipppunkt: SAIC-GM Absatz −56,5% → Abschreibungen &gt;30 Mrd. RMB (2024) → Gewinn −88% → </w:t>
+      </w:r>
+      <w:r>
+        <w:rPr>
+          <w:b/>
+        </w:rPr>
+        <w:t>ROE nur 0,58%</w:t>
+      </w:r>
+      <w:r>
+        <w:t xml:space="preserve"> (steht auf der Folie!)</w:t>
       </w:r>
     </w:p>
     <w:p>
@@ -1609,7 +1647,16 @@
         <w:pStyle w:val="ListBullet"/>
       </w:pPr>
       <w:r>
-        <w:t>ABER: JV-Rente nimmt Erfindungsdruck weg → &gt;150 Mrd. RMB kumuliert investiert, trotzdem keine eigene Batterie-Lieferkette (anders als BYD)</w:t>
+        <w:t xml:space="preserve">ABER: JV-Rente nimmt Erfindungsdruck weg → &gt;150 Mrd. RMB kumuliert investiert, trotzdem </w:t>
+      </w:r>
+      <w:r>
+        <w:rPr>
+          <w:b/>
+        </w:rPr>
+        <w:t>kein eigenes EV-Plattform</w:t>
+      </w:r>
+      <w:r>
+        <w:t xml:space="preserve"> (exakter Folien-Wortlaut, nicht "Batterie-Lieferkette"!)</w:t>
       </w:r>
     </w:p>
     <w:p>
@@ -1858,6 +1905,14 @@
       </w:pPr>
       <w:r>
         <w:t>Kernaussage: Struktur &gt; Technologie, über alle 4 Dimensionen</w:t>
+      </w:r>
+    </w:p>
+    <w:p>
+      <w:pPr>
+        <w:pStyle w:val="ListBullet"/>
+      </w:pPr>
+      <w:r>
+        <w:t>2020–2025 als natürliches Experiment (Folien-Bullet!): gleiche Branche, gleicher Schock, 3 Strukturen, 3 Ergebnisse</w:t>
       </w:r>
     </w:p>
     <w:p>
@@ -2007,7 +2062,7 @@
         <w:pStyle w:val="ListBullet"/>
       </w:pPr>
       <w:r>
-        <w:t>SAIC: SASAC → SAIC Group (~64%) → SAIC Motor · "two consistencies" in the charter · 2025: supervisory board abolished → audit committee</w:t>
+        <w:t>SAIC: state ~73% (SASAC + several other Chinese state-linked blockholders combined, not one single stake!) · Party mandate in the charter → optimises beyond shareholder value</w:t>
       </w:r>
     </w:p>
     <w:p>
@@ -2015,7 +2070,7 @@
         <w:pStyle w:val="ListBullet"/>
       </w:pPr>
       <w:r>
-        <w:t>Speed-cost example: SAIC-GM — no unilateral restructuring, years not weeks</w:t>
+        <w:t>Connected firms lag ~18% post-IPO (Fan et al., 2007)</w:t>
       </w:r>
     </w:p>
     <w:p>
@@ -2023,7 +2078,23 @@
         <w:pStyle w:val="ListBullet"/>
       </w:pPr>
       <w:r>
-        <w:t>⚠️ STOP after "...it took years." → Batu (BYD) and Chiara (Geely) continue, Chiara closes the slide</w:t>
+        <w:t>Cannot exit an unprofitable JV without state sign-off</w:t>
+      </w:r>
+    </w:p>
+    <w:p>
+      <w:pPr>
+        <w:pStyle w:val="ListBullet"/>
+      </w:pPr>
+      <w:r>
+        <w:t>Punchline (it's literally on the slide): "Slow capital reallocation → strategic inflexibility"</w:t>
+      </w:r>
+    </w:p>
+    <w:p>
+      <w:pPr>
+        <w:pStyle w:val="ListBullet"/>
+      </w:pPr>
+      <w:r>
+        <w:t>⚠️ STOP after "...matters most." → Batu (BYD) and Chiara (Geely) continue. No shared takeaway box on this slide — Chiara closes with Geely's own one-liner</w:t>
       </w:r>
     </w:p>
     <w:p>
@@ -2071,7 +2142,15 @@
         <w:pStyle w:val="ListBullet"/>
       </w:pPr>
       <w:r>
-        <w:t>Provisional rate was 36.3% → corrected by just 1 point</w:t>
+        <w:t>2nd slide bullet (don't skip!): adaptability rises with control concentration — JV board (both partners) → state oversight → founder control</w:t>
+      </w:r>
+    </w:p>
+    <w:p>
+      <w:pPr>
+        <w:pStyle w:val="ListBullet"/>
+      </w:pPr>
+      <w:r>
+        <w:t>Takeaway box: "Governance is a first-order determinant of competitive position, not an administrative footnote."</w:t>
       </w:r>
     </w:p>
     <w:p>
@@ -2117,7 +2196,7 @@
         <w:pStyle w:val="ListBullet"/>
       </w:pPr>
       <w:r>
-        <w:t>SAIC capital-light mechanics: JV partners (VW/GM) invest, SAIC collects ~50% equity income, worked for ~40 years</w:t>
+        <w:t>SAIC capital-light mechanics: JV partners (VW/GM) invest, SAIC collects ~50% equity income</w:t>
       </w:r>
     </w:p>
     <w:p>
@@ -2125,7 +2204,16 @@
         <w:pStyle w:val="ListBullet"/>
       </w:pPr>
       <w:r>
-        <w:t>Tipping point: SAIC-GM sales −56.5% → write-downs &gt;RMB 30bn (2024) → profit −88%</w:t>
+        <w:t xml:space="preserve">Tipping point: SAIC-GM sales −56.5% → write-downs &gt;RMB 30bn (2024) → profit −88% → </w:t>
+      </w:r>
+      <w:r>
+        <w:rPr>
+          <w:b/>
+        </w:rPr>
+        <w:t>ROE just 0.58%</w:t>
+      </w:r>
+      <w:r>
+        <w:t xml:space="preserve"> (it's on the slide!)</w:t>
       </w:r>
     </w:p>
     <w:p>
@@ -2173,7 +2261,16 @@
         <w:pStyle w:val="ListBullet"/>
       </w:pPr>
       <w:r>
-        <w:t>BUT: steady JV profit removes pressure to invent → &gt;RMB 150bn cumulative investment, still no proprietary battery supply chain (unlike BYD)</w:t>
+        <w:t xml:space="preserve">BUT: steady JV profit removes pressure to invent → &gt;RMB 150bn cumulative investment, still </w:t>
+      </w:r>
+      <w:r>
+        <w:rPr>
+          <w:b/>
+        </w:rPr>
+        <w:t>no EV platform of its own</w:t>
+      </w:r>
+      <w:r>
+        <w:t xml:space="preserve"> (exact slide wording — not "battery supply chain"!)</w:t>
       </w:r>
     </w:p>
     <w:p>
@@ -2422,6 +2519,14 @@
       </w:pPr>
       <w:r>
         <w:t>Core point: structure &gt; technology, across all 4 dimensions</w:t>
+      </w:r>
+    </w:p>
+    <w:p>
+      <w:pPr>
+        <w:pStyle w:val="ListBullet"/>
+      </w:pPr>
+      <w:r>
+        <w:t>2020–2025 as natural experiment (it's a slide bullet!): same industry, same shock, 3 structures, 3 outcomes</w:t>
       </w:r>
     </w:p>
     <w:p>

</xml_diff>

<commit_message>
tighten precision on Folie 8/10/12 to match exact deck figures
- use the deck's exact percentages instead of vague paraphrases:
  SAIC-GM sales -56.5% (was "more than half"), quality +8.3% (was
  "roughly eight percent"), own-brand NEV +33% and "zero subsidies"
  (was "roughly a third" / "no direct subsidies")
- name Bai & Howell inline on the capability-building slide, matching
  the citation shown on the slide
- flag the Huawei/SHANGJIE and "Joint Venture 2.0" material on Folie 12
  as wiki-sourced background not shown on the slide itself, so Julia
  knows it's optional context rather than a slide bullet
- re-export docx from the corrected markdown
</commit_message>
<xml_diff>
--- a/research/wiki/saic-motor/Doc/praesentation-sprechtext-julia.docx
+++ b/research/wiki/saic-motor/Doc/praesentation-sprechtext-julia.docx
@@ -41,7 +41,7 @@
         <w:t>Geschätzte Redezeit:</w:t>
       </w:r>
       <w:r>
-        <w:t xml:space="preserve"> ~1.779 Wörter ≈ </w:t>
+        <w:t xml:space="preserve"> ~1.774 Wörter ≈ </w:t>
       </w:r>
       <w:r>
         <w:rPr>
@@ -50,7 +50,7 @@
         <w:t>~13 Minuten</w:t>
       </w:r>
       <w:r>
-        <w:t xml:space="preserve"> (12,7 min @140 wpm / 13,7 min @130 wpm)</w:t>
+        <w:t xml:space="preserve"> (12,7 min @140 wpm / 13,6 min @130 wpm)</w:t>
       </w:r>
     </w:p>
     <w:p>
@@ -837,7 +837,7 @@
         <w:pStyle w:val="IntenseQuote"/>
       </w:pPr>
       <w:r>
-        <w:t>SAIC was capital-light: its joint-venture partners — Volkswagen, General Motors — co-invested in the factories, and SAIC collected roughly half the equity income without carrying the full risk. That felt safe — until SAIC-GM sales fell by more than half, triggering write-downs of over thirty billion renminbi in 2024. The same fifty-fifty structure that once shared the upside now shared the downside, and SAIC was still bound to absorb its share, with no unilateral control to fix the business. Net profit fell eighty-eight percent, and return on equity dropped to just zero point five eight percent — the capital-light model had become a capital trap.</w:t>
+        <w:t>SAIC was capital-light: its joint-venture partners — Volkswagen, General Motors — co-invested in the factories, and SAIC collected roughly half the equity income without carrying the full risk. That felt safe — until SAIC-GM sales fell fifty-six point five percent, triggering impairments. The same fifty-fifty structure that once shared the upside now shared the downside, and SAIC was still bound to absorb its share, with no unilateral control to fix the business. Net profit fell eighty-eight percent, and return on equity dropped to just zero point five eight percent — the capital-light model had become a capital trap.</w:t>
       </w:r>
     </w:p>
     <w:p>
@@ -894,7 +894,7 @@
         <w:pStyle w:val="IntenseQuote"/>
       </w:pPr>
       <w:r>
-        <w:t>SAIC's route was mandated technology transfer: the price of market access was a joint venture meant to work as a classroom. It did work, to a point — studies find roughly an eight percent quality gain. But steady JV profit also removed the pressure to invent: why fund risky in-house R&amp;D when the joint venture already pays the dividend? SAIC has poured over one hundred fifty billion renminbi cumulatively into EV investment, and still had no EV platform of its own when the cycle turned. It had the capital, but not the platform.</w:t>
+        <w:t>SAIC's route was mandated technology transfer: the price of market access was a joint venture meant to work as a classroom. It did work, to a point — Bai and Howell find an eight point three percent quality gain. But steady JV profit also killed its own R&amp;D: why fund risky in-house work when the joint venture already pays the dividend? SAIC has poured over one hundred fifty billion renminbi cumulatively into EV investment, and still had no EV platform of its own when the cycle turned. It had the capital, but not the platform.</w:t>
       </w:r>
     </w:p>
     <w:p>
@@ -1044,7 +1044,7 @@
         <w:pStyle w:val="IntenseQuote"/>
       </w:pPr>
       <w:r>
-        <w:t>SAIC is the most exposed — we just saw its plants running at a fraction of capacity — but to be fair, its own brand is genuinely growing: NEV sales up roughly a third year over year, with no direct state subsidies. SAIC has also launched a new brand with Huawei, SHANGJIE, part of what it calls "Joint Venture 2.0" — repurposing idle JV factory floor for its own-brand products.</w:t>
+        <w:t>SAIC is the most exposed — we just saw its plants running at a fraction of capacity — but to be fair, its own brand is genuinely growing: NEV sales up thirty-three percent year over year, with zero subsidies behind that growth. SAIC has also launched a new brand with Huawei, SHANGJIE, part of what it calls "Joint Venture 2.0" — repurposing idle JV factory floor for its own-brand products.</w:t>
       </w:r>
     </w:p>
     <w:p>
@@ -1590,7 +1590,25 @@
         <w:pStyle w:val="ListBullet"/>
       </w:pPr>
       <w:r>
-        <w:t xml:space="preserve">Kipppunkt: SAIC-GM Absatz −56,5% → Abschreibungen &gt;30 Mrd. RMB (2024) → Gewinn −88% → </w:t>
+        <w:t xml:space="preserve">Kipppunkt (exakte Folien-Zahlen!): SAIC-GM Absatz </w:t>
+      </w:r>
+      <w:r>
+        <w:rPr>
+          <w:b/>
+        </w:rPr>
+        <w:t>−56,5%</w:t>
+      </w:r>
+      <w:r>
+        <w:t xml:space="preserve"> → Abschreibungen → Gewinn </w:t>
+      </w:r>
+      <w:r>
+        <w:rPr>
+          <w:b/>
+        </w:rPr>
+        <w:t>−88%</w:t>
+      </w:r>
+      <w:r>
+        <w:t xml:space="preserve"> → </w:t>
       </w:r>
       <w:r>
         <w:rPr>
@@ -1598,9 +1616,6 @@
         </w:rPr>
         <w:t>ROE nur 0,58%</w:t>
       </w:r>
-      <w:r>
-        <w:t xml:space="preserve"> (steht auf der Folie!)</w:t>
-      </w:r>
     </w:p>
     <w:p>
       <w:pPr>
@@ -1639,7 +1654,16 @@
         <w:pStyle w:val="ListBullet"/>
       </w:pPr>
       <w:r>
-        <w:t>SAIC: Pflicht-Techtransfer als "Klassenzimmer" → Qualität +8,3% (Studienbeleg)</w:t>
+        <w:t xml:space="preserve">SAIC: Pflicht-Techtransfer als "Klassenzimmer" → Qualität </w:t>
+      </w:r>
+      <w:r>
+        <w:rPr>
+          <w:b/>
+        </w:rPr>
+        <w:t>+8,3%</w:t>
+      </w:r>
+      <w:r>
+        <w:t xml:space="preserve"> (exakte Zahl, nicht "ca. 8%"; Bai &amp; Howell)</w:t>
       </w:r>
     </w:p>
     <w:p>
@@ -1750,7 +1774,25 @@
         <w:pStyle w:val="ListBullet"/>
       </w:pPr>
       <w:r>
-        <w:t>SAIC: am exponiertesten (Auslastung), ABER eigene Marke NEV +~33% ohne Subventionen</w:t>
+        <w:t xml:space="preserve">SAIC: am exponiertesten (Auslastung), ABER eigene Marke NEV </w:t>
+      </w:r>
+      <w:r>
+        <w:rPr>
+          <w:b/>
+        </w:rPr>
+        <w:t>+33%</w:t>
+      </w:r>
+      <w:r>
+        <w:t xml:space="preserve"> (exakte Zahl!), </w:t>
+      </w:r>
+      <w:r>
+        <w:rPr>
+          <w:b/>
+        </w:rPr>
+        <w:t>zero subsidies</w:t>
+      </w:r>
+      <w:r>
+        <w:t xml:space="preserve"> (nicht "keine direkten")</w:t>
       </w:r>
     </w:p>
     <w:p>
@@ -1758,7 +1800,13 @@
         <w:pStyle w:val="ListBullet"/>
       </w:pPr>
       <w:r>
-        <w:t>Huawei-Kooperation: neue Marke SHANGJIE, erstes Modell 2025 · Konzept "Joint Venture 2.0" (freie JV-Kapazität für Eigenmarken)</w:t>
+        <w:t xml:space="preserve">Huawei-Kooperation: neue Marke SHANGJIE, erstes Modell 2025 · Konzept "Joint Venture 2.0" (freie JV-Kapazität für Eigenmarken) — ⚠️ </w:t>
+      </w:r>
+      <w:r>
+        <w:rPr>
+          <w:i/>
+        </w:rPr>
+        <w:t>steht NICHT auf der Folie, ist Zusatzwissen aus dem Wiki (AR2025), inhaltlich korrekt aber optional</w:t>
       </w:r>
     </w:p>
     <w:p>
@@ -2204,7 +2252,25 @@
         <w:pStyle w:val="ListBullet"/>
       </w:pPr>
       <w:r>
-        <w:t xml:space="preserve">Tipping point: SAIC-GM sales −56.5% → write-downs &gt;RMB 30bn (2024) → profit −88% → </w:t>
+        <w:t xml:space="preserve">Tipping point (exact slide numbers!): SAIC-GM sales </w:t>
+      </w:r>
+      <w:r>
+        <w:rPr>
+          <w:b/>
+        </w:rPr>
+        <w:t>−56.5%</w:t>
+      </w:r>
+      <w:r>
+        <w:t xml:space="preserve"> → impairments → profit </w:t>
+      </w:r>
+      <w:r>
+        <w:rPr>
+          <w:b/>
+        </w:rPr>
+        <w:t>−88%</w:t>
+      </w:r>
+      <w:r>
+        <w:t xml:space="preserve"> → </w:t>
       </w:r>
       <w:r>
         <w:rPr>
@@ -2212,9 +2278,6 @@
         </w:rPr>
         <w:t>ROE just 0.58%</w:t>
       </w:r>
-      <w:r>
-        <w:t xml:space="preserve"> (it's on the slide!)</w:t>
-      </w:r>
     </w:p>
     <w:p>
       <w:pPr>
@@ -2253,7 +2316,16 @@
         <w:pStyle w:val="ListBullet"/>
       </w:pPr>
       <w:r>
-        <w:t>SAIC: mandatory tech transfer as "classroom" → quality +8% (study evidence)</w:t>
+        <w:t xml:space="preserve">SAIC: mandatory tech transfer as "classroom" → quality </w:t>
+      </w:r>
+      <w:r>
+        <w:rPr>
+          <w:b/>
+        </w:rPr>
+        <w:t>+8.3%</w:t>
+      </w:r>
+      <w:r>
+        <w:t xml:space="preserve"> (exact figure, not "roughly 8%"; Bai &amp; Howell)</w:t>
       </w:r>
     </w:p>
     <w:p>
@@ -2364,7 +2436,25 @@
         <w:pStyle w:val="ListBullet"/>
       </w:pPr>
       <w:r>
-        <w:t>SAIC: most exposed (utilization), BUT own-brand NEV +~33%, no subsidies</w:t>
+        <w:t xml:space="preserve">SAIC: most exposed (utilization), BUT own-brand NEV </w:t>
+      </w:r>
+      <w:r>
+        <w:rPr>
+          <w:b/>
+        </w:rPr>
+        <w:t>+33%</w:t>
+      </w:r>
+      <w:r>
+        <w:t xml:space="preserve"> (exact figure!), </w:t>
+      </w:r>
+      <w:r>
+        <w:rPr>
+          <w:b/>
+        </w:rPr>
+        <w:t>zero subsidies</w:t>
+      </w:r>
+      <w:r>
+        <w:t xml:space="preserve"> (not "no direct")</w:t>
       </w:r>
     </w:p>
     <w:p>
@@ -2372,7 +2462,13 @@
         <w:pStyle w:val="ListBullet"/>
       </w:pPr>
       <w:r>
-        <w:t>Huawei tie-up: new brand SHANGJIE, first model 2025 · "Joint Venture 2.0" concept (idle JV capacity → own brands)</w:t>
+        <w:t xml:space="preserve">Huawei tie-up: new brand SHANGJIE, first model 2025 · "Joint Venture 2.0" concept (idle JV capacity → own brands) — ⚠️ </w:t>
+      </w:r>
+      <w:r>
+        <w:rPr>
+          <w:i/>
+        </w:rPr>
+        <w:t>NOT on the slide, extra wiki background (AR2025), accurate but optional</w:t>
       </w:r>
     </w:p>
     <w:p>

</xml_diff>